<commit_message>
update 'Settings - semester-config (subjects, dates, etc.).docx', script.js and styles.css
</commit_message>
<xml_diff>
--- a/Settings - semester-config (subjects, dates, etc.).docx
+++ b/Settings - semester-config (subjects, dates, etc.).docx
@@ -2848,7 +2848,7 @@
                 <w:sz w:val="18"/>
                 <w:szCs w:val="18"/>
               </w:rPr>
-              <w:t>Tue</w:t>
+              <w:t>Thu</w:t>
             </w:r>
           </w:p>
         </w:tc>
@@ -2884,7 +2884,7 @@
                 <w:sz w:val="18"/>
                 <w:szCs w:val="18"/>
               </w:rPr>
-              <w:t>PM</w:t>
+              <w:t>AM</w:t>
             </w:r>
           </w:p>
         </w:tc>

</xml_diff>